<commit_message>
Pre-Entrega 3: corrige las variables que más pesan según SHAP
Modo A: dominan la fracción del pico, la fracción de días producidos,
la tendencia y el horizonte (más corte de agua y yacimiento en petróleo).
Modo B: se agrega el mes de vida, que es la variable de mayor peso.

Co-Authored-By: Claude Opus 5.5 <noreply@anthropic.com>
</commit_message>
<xml_diff>
--- a/docs/Pre_Entrega_3_YPF.docx
+++ b/docs/Pre_Entrega_3_YPF.docx
@@ -4167,7 +4167,7 @@
         <w:pStyle w:val="ListBullet"/>
       </w:pPr>
       <w:r>
-        <w:t>Modo A: dominan el horizonte, la posición respecto del pico, la tendencia reciente y los meses en producción. El modelo aprendió la física de la declinación: los pozos jóvenes declinan rápido y los maduros se estabilizan.</w:t>
+        <w:t>Modo A: dominan la posición respecto del pico (producción actual / pico histórico), la fracción de días producidos en el último mes (si fue parcial por una parada, el modelo espera una recuperación), la tendencia reciente y el horizonte; en petróleo pesan además el corte de agua y el yacimiento. El modelo aprendió la física de la declinación: un pozo en su pico solo puede bajar, y los pozos jóvenes declinan más rápido que los maduros.</w:t>
       </w:r>
     </w:p>
     <w:p>
@@ -4175,7 +4175,7 @@
         <w:pStyle w:val="ListBullet"/>
       </w:pPr>
       <w:r>
-        <w:t>Modo B: pesan la profundidad, el yacimiento, el año de inicio (proxy de tecnología de completación), la ubicación y el tipo de pozo.</w:t>
+        <w:t>Modo B: pesan el mes de vida (la forma de la curva), la profundidad (en pozos horizontales incluye la rama lateral), el yacimiento, el tipo de pozo declarado, el año de inicio (proxy de tecnología de completación) y la ubicación.</w:t>
       </w:r>
     </w:p>
     <w:p>

</xml_diff>